<commit_message>
Remove screenshot frame from home comparison
</commit_message>
<xml_diff>
--- a/docs/reference/TheDigitalCardBox User Journey and Economics.docx
+++ b/docs/reference/TheDigitalCardBox User Journey and Economics.docx
@@ -3912,6 +3912,11 @@
         <w:t>The 22 October GIF picker has 144 choices, multiword search, feeling/occasion shortcuts and 24-result pages. The 120 added Noto animations can be stored with the cards under CC BY 4.0 with attribution. Static posters, play/pause and reduced motion remain available. CardVault exports and the new book-animation archive include actual media and credits; these data archives are separate from paid polished book delivery. No GIF provider subscription or custom agreement is needed.</w:t>
       </w:r>
     </w:p>
+    <w:p>
+      <w:r>
+        <w:t xml:space="preserve">22 October 2026 — Home comparison presentation: show the original before-and-after artwork without its charcoal screenshot surround, using a proportional CSS viewport in both the page and full-size dialog. Preserve all original artwork, lettering and comparison panels; add no replacement bitmap, frame or shadow. Keep the compact phone height budget, accessible description, keyboard opening, Escape/close and focus return. Story #85 under epic #84 remains open and In Progress for owner review.</w:t>
+      </w:r>
+    </w:p>
     <w:sectPr>
       <w:footerReference w:type="default" r:id="rId9"/>
       <w:pgSz w:w="12240" w:h="15840"/>

</xml_diff>